<commit_message>
Files updated for 2v4
</commit_message>
<xml_diff>
--- a/man/wmawk2.docx
+++ b/man/wmawk2.docx
@@ -24,19 +24,19 @@
         <w:t>.</w:t>
       </w:r>
       <w:r>
-        <w:t>3</w:t>
+        <w:t>4</w:t>
       </w:r>
       <w:r>
         <w:t xml:space="preserve">, </w:t>
       </w:r>
       <w:r>
-        <w:t>June</w:t>
-      </w:r>
-      <w:r>
-        <w:t xml:space="preserve"> 2</w:t>
-      </w:r>
-      <w:r>
-        <w:t>6</w:t>
+        <w:t>September</w:t>
+      </w:r>
+      <w:r>
+        <w:t xml:space="preserve"> </w:t>
+      </w:r>
+      <w:r>
+        <w:t>9</w:t>
       </w:r>
       <w:r>
         <w:rPr>
@@ -11295,7 +11295,10 @@
         <w:t xml:space="preserve"> for example search “</w:t>
       </w:r>
       <w:r>
-        <w:t>adding a directory to path windows 10</w:t>
+        <w:t>adding a directory to path windows 1</w:t>
+      </w:r>
+      <w:r>
+        <w:t>1</w:t>
       </w:r>
       <w:r>
         <w:t>”</w:t>
@@ -11392,16 +11395,56 @@
         <w:t>s</w:t>
       </w:r>
       <w:r>
-        <w:t xml:space="preserve"> atof.</w:t>
-      </w:r>
-      <w:r>
-        <w:t xml:space="preserve">*, </w:t>
-      </w:r>
-      <w:r>
-        <w:t>unicode.</w:t>
-      </w:r>
-      <w:r>
-        <w:t xml:space="preserve">* and ya_sprintf </w:t>
+        <w:t xml:space="preserve"> </w:t>
+      </w:r>
+      <w:proofErr w:type="spellStart"/>
+      <w:proofErr w:type="gramStart"/>
+      <w:r>
+        <w:t>atof</w:t>
+      </w:r>
+      <w:proofErr w:type="spellEnd"/>
+      <w:r>
+        <w:t>.</w:t>
+      </w:r>
+      <w:r>
+        <w:t>*</w:t>
+      </w:r>
+      <w:proofErr w:type="gramEnd"/>
+      <w:r>
+        <w:t xml:space="preserve">, </w:t>
+      </w:r>
+      <w:proofErr w:type="spellStart"/>
+      <w:r>
+        <w:t>unicode</w:t>
+      </w:r>
+      <w:proofErr w:type="spellEnd"/>
+      <w:r>
+        <w:t>.</w:t>
+      </w:r>
+      <w:r>
+        <w:t>*</w:t>
+      </w:r>
+      <w:r>
+        <w:t xml:space="preserve">, </w:t>
+      </w:r>
+      <w:proofErr w:type="spellStart"/>
+      <w:r>
+        <w:t>ya_crmath_lib</w:t>
+      </w:r>
+      <w:proofErr w:type="spellEnd"/>
+      <w:r>
+        <w:t>,</w:t>
+      </w:r>
+      <w:r>
+        <w:t xml:space="preserve"> and </w:t>
+      </w:r>
+      <w:proofErr w:type="spellStart"/>
+      <w:r>
+        <w:t>ya_sprintf</w:t>
+      </w:r>
+      <w:proofErr w:type="spellEnd"/>
+      <w:r>
+        <w:t xml:space="preserve"> </w:t>
       </w:r>
       <w:r>
         <w:t xml:space="preserve"> are </w:t>
@@ -11523,6 +11566,7 @@
         <w:pStyle w:val="BodyText"/>
       </w:pPr>
       <w:r>
+        <w:lastRenderedPageBreak/>
         <w:t xml:space="preserve">Version </w:t>
       </w:r>
       <w:r>
@@ -11573,11 +11617,7 @@
         <w:t xml:space="preserve">the </w:t>
       </w:r>
       <w:r>
-        <w:t xml:space="preserve">command line, environment </w:t>
-      </w:r>
-      <w:r>
-        <w:lastRenderedPageBreak/>
-        <w:t>variables, filenames and system/pipe commands</w:t>
+        <w:t>command line, environment variables, filenames and system/pipe commands</w:t>
       </w:r>
       <w:r>
         <w:t xml:space="preserve"> and allows the console output to display uft8 characters, and utf8 characters to be input from the console via stdin. It does not change any of the string handling or matching functions [ including regular expressions] (which still assume 8-bit characters). For more details see the “Unicode support” section of this manual.</w:t>
@@ -11830,7 +11870,11 @@
         <w:t>-5357105737.0884304</w:t>
       </w:r>
       <w:r>
-        <w:t xml:space="preserve">” as its trailing </w:t>
+        <w:t xml:space="preserve">” as </w:t>
+      </w:r>
+      <w:r>
+        <w:lastRenderedPageBreak/>
+        <w:t xml:space="preserve">its trailing </w:t>
       </w:r>
       <w:r>
         <w:t>zeroes</w:t>
@@ -11844,7 +11888,6 @@
         <w:pStyle w:val="BodyText"/>
       </w:pPr>
       <w:r>
-        <w:lastRenderedPageBreak/>
         <w:t xml:space="preserve"> For less than 15 significant digits there is only 1 correctly rounded value which wmawk2 will create. For 15 and 16 significant digits there can be more than one correctly rounded value so its possible different wmawk2 versions will create (very) slightly different numbers for this range.</w:t>
       </w:r>
     </w:p>
@@ -12005,16 +12048,7 @@
       </w:r>
       <w:proofErr w:type="spellEnd"/>
       <w:r>
-        <w:t xml:space="preserve"> (2v</w:t>
-      </w:r>
-      <w:r>
-        <w:t>5</w:t>
-      </w:r>
-      <w:r>
-        <w:t>)</w:t>
-      </w:r>
-      <w:r>
-        <w:t xml:space="preserve"> which is faster for some numbers when converted via %f. The example below (crafted to give the maximum improvement) runs ~ 10% faster with wmawk2 version 2.3, but no significant speedup is shown on the test programs in the directory “test” when running </w:t>
+        <w:t xml:space="preserve"> (2v5) which is faster for some numbers when converted via %f. The example below (crafted to give the maximum improvement) runs ~ 10% faster with wmawk2 version 2.3, but no significant speedup is shown on the test programs in the directory “test” when running </w:t>
       </w:r>
       <w:r>
         <w:t>wmawk2test.bat</w:t>
@@ -12161,9 +12195,446 @@
         <w:t>For comparison wmawk2 2v2 is 25% faster than 2v1 on this test.</w:t>
       </w:r>
     </w:p>
+    <w:p>
+      <w:pPr>
+        <w:pStyle w:val="BodyText"/>
+      </w:pPr>
+      <w:r>
+        <w:t xml:space="preserve">Version </w:t>
+      </w:r>
+      <w:r>
+        <w:rPr>
+          <w:b/>
+          <w:bCs/>
+        </w:rPr>
+        <w:t>2.</w:t>
+      </w:r>
+      <w:r>
+        <w:rPr>
+          <w:b/>
+          <w:bCs/>
+        </w:rPr>
+        <w:t>4</w:t>
+      </w:r>
+      <w:r>
+        <w:rPr>
+          <w:b/>
+          <w:bCs/>
+        </w:rPr>
+        <w:t xml:space="preserve"> </w:t>
+      </w:r>
+      <w:r>
+        <w:t xml:space="preserve">uses </w:t>
+      </w:r>
+      <w:proofErr w:type="spellStart"/>
+      <w:r>
+        <w:t>ya_crmath_lib</w:t>
+      </w:r>
+      <w:proofErr w:type="spellEnd"/>
+      <w:r>
+        <w:t xml:space="preserve"> ( </w:t>
+      </w:r>
+      <w:hyperlink r:id="rId29" w:history="1">
+        <w:r>
+          <w:rPr>
+            <w:rStyle w:val="Hyperlink"/>
+          </w:rPr>
+          <w:t>https://github.com/p-j-miller/ya_crmath_lib</w:t>
+        </w:r>
+      </w:hyperlink>
+      <w:r>
+        <w:rPr>
+          <w:rStyle w:val="Hyperlink"/>
+        </w:rPr>
+        <w:t xml:space="preserve"> </w:t>
+      </w:r>
+      <w:r>
+        <w:t>)</w:t>
+      </w:r>
+      <w:r>
+        <w:t xml:space="preserve"> to give </w:t>
+      </w:r>
+      <w:r>
+        <w:t xml:space="preserve">very </w:t>
+      </w:r>
+      <w:r>
+        <w:t xml:space="preserve">accurate values for the cos, sin, atan2, exp and log functions and the “^” (power) operator. Previously wmawk2 </w:t>
+      </w:r>
+      <w:r>
+        <w:t>used the</w:t>
+      </w:r>
+      <w:r>
+        <w:t xml:space="preserve"> functions provided by the compiler for these, however</w:t>
+      </w:r>
+      <w:r>
+        <w:t xml:space="preserve"> since version 1.1 </w:t>
+      </w:r>
+      <w:r>
+        <w:t>that meant wmawk2 was using these functions in the UCRT, which is part of the Windows operating system.  This was not expected to be an issue, but it</w:t>
+      </w:r>
+      <w:r>
+        <w:t xml:space="preserve"> ha</w:t>
+      </w:r>
+      <w:r>
+        <w:t xml:space="preserve">s been found that the results can now change depending upon the </w:t>
+      </w:r>
+      <w:r>
+        <w:t xml:space="preserve"> </w:t>
+      </w:r>
+      <w:r>
+        <w:t xml:space="preserve">operating system (and update) that is used - </w:t>
+      </w:r>
+      <w:hyperlink r:id="rId30" w:history="1">
+        <w:r>
+          <w:rPr>
+            <w:rStyle w:val="Hyperlink"/>
+          </w:rPr>
+          <w:t>https://blog.r-project.org/2025/05/21/sensitivity-to-c-math-library-and-mingw-</w:t>
+        </w:r>
+        <w:r>
+          <w:rPr>
+            <w:rStyle w:val="Hyperlink"/>
+          </w:rPr>
+          <w:lastRenderedPageBreak/>
+          <w:t>w64-v12-part-2/</w:t>
+        </w:r>
+      </w:hyperlink>
+      <w:r>
+        <w:t xml:space="preserve"> gives a few examples where sin() and exp() do actually give different results (between different Versions of Windows and also when running </w:t>
+      </w:r>
+      <w:r>
+        <w:t xml:space="preserve">the same version of </w:t>
+      </w:r>
+      <w:r>
+        <w:t>Windows virtualized</w:t>
+      </w:r>
+      <w:r>
+        <w:t xml:space="preserve"> or not</w:t>
+      </w:r>
+      <w:r>
+        <w:t>) and the wmawk2 test programs have also identified issues with sin().</w:t>
+      </w:r>
+      <w:r>
+        <w:t xml:space="preserve"> Even the typically achieved errors </w:t>
+      </w:r>
+      <w:r>
+        <w:t xml:space="preserve">by the UCRT functions as </w:t>
+      </w:r>
+      <w:r>
+        <w:t xml:space="preserve">given at </w:t>
+      </w:r>
+      <w:hyperlink r:id="rId31" w:history="1">
+        <w:r>
+          <w:rPr>
+            <w:rStyle w:val="Hyperlink"/>
+          </w:rPr>
+          <w:t>https://members.loria.fr/PZimmermann/papers/accuracy.pdf</w:t>
+        </w:r>
+      </w:hyperlink>
+      <w:r>
+        <w:t xml:space="preserve"> , table 3, MSVC 2026 column are not “best in class” (which is 0.500</w:t>
+      </w:r>
+      <w:r>
+        <w:t>ulp</w:t>
+      </w:r>
+      <w:r>
+        <w:t xml:space="preserve">). </w:t>
+      </w:r>
+      <w:r>
+        <w:t xml:space="preserve"> This document </w:t>
+      </w:r>
+      <w:r>
+        <w:t xml:space="preserve">(accuracy.pdf) </w:t>
+      </w:r>
+      <w:r>
+        <w:t xml:space="preserve">also notes that some machine code instructions give different results on Intel &amp; AMD processors </w:t>
+      </w:r>
+      <w:r>
+        <w:t xml:space="preserve">(e.g. the </w:t>
+      </w:r>
+      <w:proofErr w:type="spellStart"/>
+      <w:r>
+        <w:t>rsqrt</w:t>
+      </w:r>
+      <w:proofErr w:type="spellEnd"/>
+      <w:r>
+        <w:t xml:space="preserve"> instruction) </w:t>
+      </w:r>
+      <w:r>
+        <w:t>which gives another potential source of variability.</w:t>
+      </w:r>
+    </w:p>
+    <w:p>
+      <w:pPr>
+        <w:pStyle w:val="BodyText"/>
+      </w:pPr>
+      <w:r>
+        <w:t>Note that while the differences between the various imp</w:t>
+      </w:r>
+      <w:r>
+        <w:t>lemen</w:t>
+      </w:r>
+      <w:r>
+        <w:t xml:space="preserve">tations are very small, they can give surprisingly large errors after a series of calculations, especially if these are printed at a relatively low resolution. For example, using %.0f to print a value as an integer (with no digits after the decimal point) is very sensitive to numbers at the 0.5 rounding boundary.  </w:t>
+      </w:r>
+      <w:r>
+        <w:t>Thus,</w:t>
+      </w:r>
+      <w:r>
+        <w:t xml:space="preserve"> 1.49999999999999999 would print as 1 b</w:t>
+      </w:r>
+      <w:r>
+        <w:t>ut</w:t>
+      </w:r>
+      <w:r>
+        <w:t xml:space="preserve"> 1.5 (only very slightly larger) would print as 2</w:t>
+      </w:r>
+      <w:r>
+        <w:t>.</w:t>
+      </w:r>
+    </w:p>
+    <w:p>
+      <w:pPr>
+        <w:pStyle w:val="BodyText"/>
+      </w:pPr>
+      <w:r>
+        <w:t>To resolve these issues, in wmawk2 version 2.</w:t>
+      </w:r>
+      <w:r>
+        <w:t>4</w:t>
+      </w:r>
+      <w:r>
+        <w:t xml:space="preserve"> t</w:t>
+      </w:r>
+      <w:r>
+        <w:t>hese functions are now calculated internally and all have “best in class” errors (0.500</w:t>
+      </w:r>
+      <w:r>
+        <w:t>ulp</w:t>
+      </w:r>
+      <w:r>
+        <w:t>).</w:t>
+      </w:r>
+      <w:r>
+        <w:t xml:space="preserve"> This should mean that a program written in wmawk2 (using version 2.</w:t>
+      </w:r>
+      <w:r>
+        <w:t>4</w:t>
+      </w:r>
+      <w:r>
+        <w:t xml:space="preserve"> or above) will give exactly the same result</w:t>
+      </w:r>
+      <w:r>
+        <w:t>s</w:t>
+      </w:r>
+      <w:r>
+        <w:t xml:space="preserve"> independent of the operating</w:t>
+      </w:r>
+      <w:r>
+        <w:t>-</w:t>
+      </w:r>
+      <w:r>
+        <w:t>system, use of virtualization</w:t>
+      </w:r>
+      <w:r>
+        <w:t>,</w:t>
+      </w:r>
+      <w:r>
+        <w:t xml:space="preserve"> or processor manufacturer.</w:t>
+      </w:r>
+    </w:p>
+    <w:p>
+      <w:pPr>
+        <w:pStyle w:val="BodyText"/>
+      </w:pPr>
+      <w:r>
+        <w:t xml:space="preserve">As an aside, wmawk2 does statically link its executable, but as stated in </w:t>
+      </w:r>
+      <w:hyperlink r:id="rId32" w:history="1">
+        <w:r>
+          <w:rPr>
+            <w:rStyle w:val="Hyperlink"/>
+          </w:rPr>
+          <w:t>https://mingwpy.github.io/ucrt.html</w:t>
+        </w:r>
+      </w:hyperlink>
+      <w:r>
+        <w:t xml:space="preserve"> and confirmed by using the “Dependencies” program on the wmawk2 executable (see screen shot below) it does end up calling the UCRT that’s part of the operating system.</w:t>
+      </w:r>
+    </w:p>
+    <w:p>
+      <w:pPr>
+        <w:pStyle w:val="BodyText"/>
+        <w:keepNext/>
+      </w:pPr>
+      <w:r>
+        <w:rPr>
+          <w:color w:val="4F81BD" w:themeColor="accent1"/>
+        </w:rPr>
+        <w:drawing>
+          <wp:inline distT="0" distB="0" distL="0" distR="0" wp14:anchorId="28E3DFAE" wp14:editId="4908E406">
+            <wp:extent cx="5839640" cy="2581635"/>
+            <wp:effectExtent l="0" t="0" r="8890" b="9525"/>
+            <wp:docPr id="1" name="Picture 1"/>
+            <wp:cNvGraphicFramePr>
+              <a:graphicFrameLocks xmlns:a="http://schemas.openxmlformats.org/drawingml/2006/main" noChangeAspect="1"/>
+            </wp:cNvGraphicFramePr>
+            <a:graphic xmlns:a="http://schemas.openxmlformats.org/drawingml/2006/main">
+              <a:graphicData uri="http://schemas.openxmlformats.org/drawingml/2006/picture">
+                <pic:pic xmlns:pic="http://schemas.openxmlformats.org/drawingml/2006/picture">
+                  <pic:nvPicPr>
+                    <pic:cNvPr id="1" name=""/>
+                    <pic:cNvPicPr/>
+                  </pic:nvPicPr>
+                  <pic:blipFill>
+                    <a:blip r:embed="rId33"/>
+                    <a:stretch>
+                      <a:fillRect/>
+                    </a:stretch>
+                  </pic:blipFill>
+                  <pic:spPr>
+                    <a:xfrm>
+                      <a:off x="0" y="0"/>
+                      <a:ext cx="5839640" cy="2581635"/>
+                    </a:xfrm>
+                    <a:prstGeom prst="rect">
+                      <a:avLst/>
+                    </a:prstGeom>
+                  </pic:spPr>
+                </pic:pic>
+              </a:graphicData>
+            </a:graphic>
+          </wp:inline>
+        </w:drawing>
+      </w:r>
+    </w:p>
+    <w:p>
+      <w:pPr>
+        <w:pStyle w:val="Caption"/>
+        <w:rPr>
+          <w:color w:val="4F81BD" w:themeColor="accent1"/>
+        </w:rPr>
+      </w:pPr>
+      <w:r>
+        <w:t xml:space="preserve">Figure </w:t>
+      </w:r>
+      <w:r>
+        <w:fldChar w:fldCharType="begin"/>
+      </w:r>
+      <w:r>
+        <w:instrText xml:space="preserve"> SEQ Figure \* ARABIC </w:instrText>
+      </w:r>
+      <w:r>
+        <w:fldChar w:fldCharType="separate"/>
+      </w:r>
+      <w:r>
+        <w:rPr>
+          <w:noProof/>
+        </w:rPr>
+        <w:t>1</w:t>
+      </w:r>
+      <w:r>
+        <w:fldChar w:fldCharType="end"/>
+      </w:r>
+      <w:r>
+        <w:t xml:space="preserve"> : Screen shot of wmawk2 dependencies output</w:t>
+      </w:r>
+    </w:p>
+    <w:p>
+      <w:pPr>
+        <w:pStyle w:val="BodyText"/>
+      </w:pPr>
+      <w:r>
+        <w:t xml:space="preserve">The number of different versions of the UCRT is very large, </w:t>
+      </w:r>
+      <w:r>
+        <w:t>because every Windows 10/11 feature update and many cumulative updates include a newer UCRT build (e.g., 10.0.10240</w:t>
+      </w:r>
+      <w:r>
+        <w:t xml:space="preserve"> (initial Windows 10 version in July 2015)</w:t>
+      </w:r>
+      <w:r>
+        <w:t xml:space="preserve">, </w:t>
+      </w:r>
+      <w:r>
+        <w:t>10.0.14393</w:t>
+      </w:r>
+      <w:r>
+        <w:t xml:space="preserve"> (August 2016)</w:t>
+      </w:r>
+      <w:r>
+        <w:t>, 10.0.15063</w:t>
+      </w:r>
+      <w:r>
+        <w:t xml:space="preserve"> (April 2017)</w:t>
+      </w:r>
+      <w:r>
+        <w:t>, … 10.0.22000</w:t>
+      </w:r>
+      <w:r>
+        <w:t xml:space="preserve"> (in August 2021, released </w:t>
+      </w:r>
+      <w:r>
+        <w:t>with</w:t>
+      </w:r>
+      <w:r>
+        <w:t xml:space="preserve"> </w:t>
+      </w:r>
+      <w:r>
+        <w:t>W</w:t>
+      </w:r>
+      <w:r>
+        <w:t xml:space="preserve">indows 11, </w:t>
+      </w:r>
+      <w:r>
+        <w:t>etc.)</w:t>
+      </w:r>
+      <w:r>
+        <w:t xml:space="preserve">, and each has its </w:t>
+      </w:r>
+      <w:r>
+        <w:lastRenderedPageBreak/>
+        <w:t>own ucrtbase.dll version</w:t>
+      </w:r>
+      <w:r>
+        <w:t>. At the time of writing this (9</w:t>
+      </w:r>
+      <w:r>
+        <w:rPr>
+          <w:vertAlign w:val="superscript"/>
+        </w:rPr>
+        <w:t>th</w:t>
+      </w:r>
+      <w:r>
+        <w:t xml:space="preserve"> September 2026) the UCRT on my Windows 11 PC is 10.0.26100 dated 09/09/2026.</w:t>
+      </w:r>
+      <w:r>
+        <w:t xml:space="preserve"> Based on </w:t>
+      </w:r>
+      <w:hyperlink r:id="rId34" w:history="1">
+        <w:r>
+          <w:rPr>
+            <w:rStyle w:val="Hyperlink"/>
+          </w:rPr>
+          <w:t>https://learn.microsoft.com/en-us/windows/apps/windows-sdk/downloads</w:t>
+        </w:r>
+      </w:hyperlink>
+      <w:r>
+        <w:t xml:space="preserve"> , there were 9 versions released in 2025 and 6 so far </w:t>
+      </w:r>
+      <w:r>
+        <w:t xml:space="preserve">(to September) </w:t>
+      </w:r>
+      <w:r>
+        <w:t>in 2026</w:t>
+      </w:r>
+      <w:r>
+        <w:t>.</w:t>
+      </w:r>
+    </w:p>
     <w:sectPr>
-      <w:headerReference w:type="default" r:id="rId29"/>
-      <w:footerReference w:type="default" r:id="rId30"/>
+      <w:headerReference w:type="default" r:id="rId35"/>
+      <w:footerReference w:type="default" r:id="rId36"/>
       <w:pgSz w:w="12240" w:h="15840"/>
       <w:pgMar w:top="1440" w:right="1440" w:bottom="1440" w:left="1440" w:header="720" w:footer="720" w:gutter="0"/>
       <w:cols w:space="720"/>
@@ -12323,7 +12794,7 @@
       <w:t>.</w:t>
     </w:r>
     <w:r>
-      <w:t>3</w:t>
+      <w:t>4</w:t>
     </w:r>
     <w:r>
       <w:t xml:space="preserve"> Manual</w:t>
@@ -13069,7 +13540,6 @@
   <w:style w:type="character" w:default="1" w:styleId="DefaultParagraphFont">
     <w:name w:val="Default Paragraph Font"/>
     <w:uiPriority w:val="1"/>
-    <w:semiHidden/>
     <w:unhideWhenUsed/>
   </w:style>
   <w:style w:type="table" w:default="1" w:styleId="TableNormal">

</xml_diff>

<commit_message>
Files updated for 2v5
</commit_message>
<xml_diff>
--- a/man/wmawk2.docx
+++ b/man/wmawk2.docx
@@ -24,7 +24,7 @@
         <w:t>.</w:t>
       </w:r>
       <w:r>
-        <w:t>4</w:t>
+        <w:t>5</w:t>
       </w:r>
       <w:r>
         <w:t xml:space="preserve">, </w:t>
@@ -36,7 +36,7 @@
         <w:t xml:space="preserve"> </w:t>
       </w:r>
       <w:r>
-        <w:t>9</w:t>
+        <w:t>28</w:t>
       </w:r>
       <w:r>
         <w:rPr>
@@ -12338,6 +12338,15 @@
         <w:t>ulp</w:t>
       </w:r>
       <w:r>
+        <w:t xml:space="preserve"> </w:t>
+      </w:r>
+      <w:r>
+        <w:t xml:space="preserve"> (unit-in-last-place)</w:t>
+      </w:r>
+      <w:r>
+        <w:t xml:space="preserve"> </w:t>
+      </w:r>
+      <w:r>
         <w:t xml:space="preserve">). </w:t>
       </w:r>
       <w:r>
@@ -12469,6 +12478,7 @@
       </w:pPr>
       <w:r>
         <w:rPr>
+          <w:noProof/>
           <w:color w:val="4F81BD" w:themeColor="accent1"/>
         </w:rPr>
         <w:drawing>
@@ -12566,7 +12576,11 @@
         <w:t>, 10.0.15063</w:t>
       </w:r>
       <w:r>
-        <w:t xml:space="preserve"> (April 2017)</w:t>
+        <w:t xml:space="preserve"> (April </w:t>
+      </w:r>
+      <w:r>
+        <w:lastRenderedPageBreak/>
+        <w:t>2017)</w:t>
       </w:r>
       <w:r>
         <w:t>, … 10.0.22000</w:t>
@@ -12590,11 +12604,7 @@
         <w:t>etc.)</w:t>
       </w:r>
       <w:r>
-        <w:t xml:space="preserve">, and each has its </w:t>
-      </w:r>
-      <w:r>
-        <w:lastRenderedPageBreak/>
-        <w:t>own ucrtbase.dll version</w:t>
+        <w:t>, and each has its own ucrtbase.dll version</w:t>
       </w:r>
       <w:r>
         <w:t>. At the time of writing this (9</w:t>
@@ -12630,6 +12640,157 @@
       </w:r>
       <w:r>
         <w:t>.</w:t>
+      </w:r>
+    </w:p>
+    <w:p>
+      <w:pPr>
+        <w:pStyle w:val="BodyText"/>
+      </w:pPr>
+      <w:r>
+        <w:t>Version 2.4 also uses the latest versions of “</w:t>
+      </w:r>
+      <w:proofErr w:type="spellStart"/>
+      <w:r>
+        <w:t>atof</w:t>
+      </w:r>
+      <w:proofErr w:type="spellEnd"/>
+      <w:r>
+        <w:t>” (1v2) and “</w:t>
+      </w:r>
+      <w:proofErr w:type="spellStart"/>
+      <w:r>
+        <w:t>ya-sprintf</w:t>
+      </w:r>
+      <w:proofErr w:type="spellEnd"/>
+      <w:r>
+        <w:t xml:space="preserve">” (2v6) and was compiled with </w:t>
+      </w:r>
+      <w:proofErr w:type="spellStart"/>
+      <w:r>
+        <w:t>gcc</w:t>
+      </w:r>
+      <w:proofErr w:type="spellEnd"/>
+      <w:r>
+        <w:t xml:space="preserve"> 16.2.0 (which generates </w:t>
+      </w:r>
+      <w:proofErr w:type="gramStart"/>
+      <w:r>
+        <w:t>an</w:t>
+      </w:r>
+      <w:proofErr w:type="gramEnd"/>
+      <w:r>
+        <w:t xml:space="preserve"> wmawk2 executable that on average runs the same speed as </w:t>
+      </w:r>
+      <w:proofErr w:type="spellStart"/>
+      <w:r>
+        <w:t>gcc</w:t>
+      </w:r>
+      <w:proofErr w:type="spellEnd"/>
+      <w:r>
+        <w:t xml:space="preserve"> 15.3.0).</w:t>
+      </w:r>
+    </w:p>
+    <w:p>
+      <w:pPr>
+        <w:pStyle w:val="BodyText"/>
+      </w:pPr>
+    </w:p>
+    <w:p>
+      <w:pPr>
+        <w:pStyle w:val="BodyText"/>
+      </w:pPr>
+      <w:r>
+        <w:t xml:space="preserve">Version </w:t>
+      </w:r>
+      <w:r>
+        <w:rPr>
+          <w:b/>
+          <w:bCs/>
+        </w:rPr>
+        <w:t>2.</w:t>
+      </w:r>
+      <w:r>
+        <w:rPr>
+          <w:b/>
+          <w:bCs/>
+        </w:rPr>
+        <w:t>5</w:t>
+      </w:r>
+      <w:r>
+        <w:rPr>
+          <w:b/>
+          <w:bCs/>
+        </w:rPr>
+        <w:t xml:space="preserve"> </w:t>
+      </w:r>
+      <w:r>
+        <w:t xml:space="preserve">changes the minimum processor requirements </w:t>
+      </w:r>
+      <w:r>
+        <w:t xml:space="preserve">for the supplied executable </w:t>
+      </w:r>
+      <w:r>
+        <w:t xml:space="preserve">to AVX2 and FMA </w:t>
+      </w:r>
+      <w:r>
+        <w:t>running in 64</w:t>
+      </w:r>
+      <w:r>
+        <w:t>-</w:t>
+      </w:r>
+      <w:r>
+        <w:t xml:space="preserve">bit mode </w:t>
+      </w:r>
+      <w:r>
+        <w:t>as these can provide a reasonable speed increase with some awk scripts.</w:t>
+      </w:r>
+      <w:r>
+        <w:t xml:space="preserve"> These functions were introduced with Intel Haswell processors in 2013 </w:t>
+      </w:r>
+      <w:r>
+        <w:t xml:space="preserve">(e.g. i3-4130) </w:t>
+      </w:r>
+      <w:r>
+        <w:t>and AMD Excavator processors in 2015.</w:t>
+      </w:r>
+      <w:r>
+        <w:t xml:space="preserve"> The source code can still be compiled for 32-bit mode and for processors without these instructions. Wmakw2 will check when executed that the processor its running on supports the functionality specified at compile time</w:t>
+      </w:r>
+      <w:r>
+        <w:t xml:space="preserve"> and will abort if this functionality is not present. </w:t>
+      </w:r>
+    </w:p>
+    <w:p>
+      <w:pPr>
+        <w:pStyle w:val="BodyText"/>
+      </w:pPr>
+      <w:r>
+        <w:t xml:space="preserve">Version 2.5 also </w:t>
+      </w:r>
+      <w:r>
+        <w:t>uses ya_</w:t>
+      </w:r>
+      <w:proofErr w:type="spellStart"/>
+      <w:r>
+        <w:t>crmath_lib</w:t>
+      </w:r>
+      <w:proofErr w:type="spellEnd"/>
+      <w:r>
+        <w:t xml:space="preserve"> 1v1 which is faster than 1v0, while providing identical results. </w:t>
+      </w:r>
+      <w:r>
+        <w:t>The test program has also been updated to provide timing details for the exp(</w:t>
+      </w:r>
+      <w:proofErr w:type="gramStart"/>
+      <w:r>
+        <w:t>),log</w:t>
+      </w:r>
+      <w:proofErr w:type="gramEnd"/>
+      <w:r>
+        <w:t>(),sin(),cos() and atan2() functions and the power operator(^), giving the estimated time per call in ns (with an i3-10100 processor sqrt is ~3ns and the power operator ~ 30ns).</w:t>
+      </w:r>
+      <w:r>
+        <w:t xml:space="preserve"> On an Intel i3-10100 the execution time for the complete test program with Wmawk2 2v5 is 225 seconds while with 2v4 its 268 seconds.</w:t>
       </w:r>
     </w:p>
     <w:sectPr>
@@ -12794,7 +12955,7 @@
       <w:t>.</w:t>
     </w:r>
     <w:r>
-      <w:t>4</w:t>
+      <w:t>5</w:t>
     </w:r>
     <w:r>
       <w:t xml:space="preserve"> Manual</w:t>
@@ -13540,6 +13701,7 @@
   <w:style w:type="character" w:default="1" w:styleId="DefaultParagraphFont">
     <w:name w:val="Default Paragraph Font"/>
     <w:uiPriority w:val="1"/>
+    <w:semiHidden/>
     <w:unhideWhenUsed/>
   </w:style>
   <w:style w:type="table" w:default="1" w:styleId="TableNormal">

</xml_diff>